<commit_message>
fix: add google accoutn info to flyer
</commit_message>
<xml_diff>
--- a/docs/using-cofi-to-experiment-with-geophysical-inversions.docx
+++ b/docs/using-cofi-to-experiment-with-geophysical-inversions.docx
@@ -274,7 +274,7 @@
       <w:pPr>
         <w:rPr>
           <w:rFonts w:cstheme="minorHAnsi"/>
-          <w:color w:val="000000" w:themeColor="text1"/>
+          <w:color w:val="2F5496" w:themeColor="accent1" w:themeShade="BF"/>
           <w:sz w:val="21"/>
           <w:szCs w:val="21"/>
         </w:rPr>
@@ -284,9 +284,10 @@
           <w:rPr>
             <w:rStyle w:val="Hyperlink"/>
             <w:rFonts w:cstheme="minorHAnsi"/>
-            <w:color w:val="000000" w:themeColor="text1"/>
+            <w:color w:val="2F5496" w:themeColor="accent1" w:themeShade="BF"/>
             <w:sz w:val="21"/>
             <w:szCs w:val="21"/>
+            <w:u w:val="none"/>
           </w:rPr>
           <w:t>https://cofi.readthedocs.io/en/latest/</w:t>
         </w:r>
@@ -886,7 +887,7 @@
         <w:jc w:val="both"/>
         <w:rPr>
           <w:rFonts w:cstheme="minorHAnsi"/>
-          <w:color w:val="000000" w:themeColor="text1"/>
+          <w:color w:val="2F5496" w:themeColor="accent1" w:themeShade="BF"/>
           <w:sz w:val="21"/>
           <w:szCs w:val="21"/>
         </w:rPr>
@@ -896,11 +897,58 @@
           <w:rPr>
             <w:rStyle w:val="Hyperlink"/>
             <w:rFonts w:ascii="Calibri" w:hAnsi="Calibri" w:cs="Calibri"/>
-            <w:color w:val="000000" w:themeColor="text1"/>
+            <w:color w:val="2F5496" w:themeColor="accent1" w:themeShade="BF"/>
             <w:sz w:val="21"/>
             <w:szCs w:val="21"/>
+            <w:u w:val="none"/>
           </w:rPr>
-          <w:t>https://inlab.au/inlab-explorer/</w:t>
+          <w:t>inla</w:t>
+        </w:r>
+        <w:r>
+          <w:rPr>
+            <w:rStyle w:val="Hyperlink"/>
+            <w:rFonts w:ascii="Calibri" w:hAnsi="Calibri" w:cs="Calibri"/>
+            <w:color w:val="2F5496" w:themeColor="accent1" w:themeShade="BF"/>
+            <w:sz w:val="21"/>
+            <w:szCs w:val="21"/>
+            <w:u w:val="none"/>
+          </w:rPr>
+          <w:t>b</w:t>
+        </w:r>
+        <w:r>
+          <w:rPr>
+            <w:rStyle w:val="Hyperlink"/>
+            <w:rFonts w:ascii="Calibri" w:hAnsi="Calibri" w:cs="Calibri"/>
+            <w:color w:val="2F5496" w:themeColor="accent1" w:themeShade="BF"/>
+            <w:sz w:val="21"/>
+            <w:szCs w:val="21"/>
+            <w:u w:val="none"/>
+          </w:rPr>
+          <w:t>.au/</w:t>
+        </w:r>
+        <w:proofErr w:type="spellStart"/>
+        <w:r>
+          <w:rPr>
+            <w:rStyle w:val="Hyperlink"/>
+            <w:rFonts w:ascii="Calibri" w:hAnsi="Calibri" w:cs="Calibri"/>
+            <w:color w:val="2F5496" w:themeColor="accent1" w:themeShade="BF"/>
+            <w:sz w:val="21"/>
+            <w:szCs w:val="21"/>
+            <w:u w:val="none"/>
+          </w:rPr>
+          <w:t>inlab</w:t>
+        </w:r>
+        <w:proofErr w:type="spellEnd"/>
+        <w:r>
+          <w:rPr>
+            <w:rStyle w:val="Hyperlink"/>
+            <w:rFonts w:ascii="Calibri" w:hAnsi="Calibri" w:cs="Calibri"/>
+            <w:color w:val="2F5496" w:themeColor="accent1" w:themeShade="BF"/>
+            <w:sz w:val="21"/>
+            <w:szCs w:val="21"/>
+            <w:u w:val="none"/>
+          </w:rPr>
+          <w:t>-explorer/</w:t>
         </w:r>
       </w:hyperlink>
     </w:p>
@@ -926,12 +974,12 @@
       <w:pPr>
         <w:pStyle w:val="Heading3"/>
         <w:rPr>
-          <w:color w:val="000000" w:themeColor="text1"/>
-        </w:rPr>
-      </w:pPr>
-      <w:r>
-        <w:rPr>
-          <w:color w:val="000000" w:themeColor="text1"/>
+          <w:color w:val="2F5496" w:themeColor="accent1" w:themeShade="BF"/>
+        </w:rPr>
+      </w:pPr>
+      <w:r>
+        <w:rPr>
+          <w:color w:val="2F5496" w:themeColor="accent1" w:themeShade="BF"/>
         </w:rPr>
         <w:t>Who should attend?</w:t>
       </w:r>
@@ -1515,12 +1563,12 @@
       <w:pPr>
         <w:pStyle w:val="Heading3"/>
         <w:rPr>
-          <w:color w:val="000000" w:themeColor="text1"/>
-        </w:rPr>
-      </w:pPr>
-      <w:r>
-        <w:rPr>
-          <w:color w:val="000000" w:themeColor="text1"/>
+          <w:color w:val="2F5496" w:themeColor="accent1" w:themeShade="BF"/>
+        </w:rPr>
+      </w:pPr>
+      <w:r>
+        <w:rPr>
+          <w:color w:val="2F5496" w:themeColor="accent1" w:themeShade="BF"/>
         </w:rPr>
         <w:t>What to bring?</w:t>
       </w:r>
@@ -1593,26 +1641,84 @@
         </w:rPr>
         <w:t xml:space="preserve"> notebooks.</w:t>
       </w:r>
-    </w:p>
-    <w:p>
-      <w:pPr>
-        <w:rPr>
-          <w:rFonts w:ascii="Helvetica" w:hAnsi="Helvetica"/>
-          <w:color w:val="000000" w:themeColor="text1"/>
-          <w:sz w:val="21"/>
-          <w:szCs w:val="21"/>
-        </w:rPr>
-      </w:pPr>
-    </w:p>
-    <w:p>
-      <w:pPr>
-        <w:rPr>
-          <w:rFonts w:ascii="Helvetica" w:hAnsi="Helvetica"/>
-          <w:color w:val="000000" w:themeColor="text1"/>
-          <w:sz w:val="21"/>
-          <w:szCs w:val="21"/>
-        </w:rPr>
-      </w:pPr>
+      <w:r>
+        <w:rPr>
+          <w:rFonts w:cstheme="minorHAnsi"/>
+          <w:color w:val="000000" w:themeColor="text1"/>
+          <w:sz w:val="21"/>
+          <w:szCs w:val="21"/>
+        </w:rPr>
+        <w:t xml:space="preserve"> </w:t>
+      </w:r>
+      <w:r>
+        <w:rPr>
+          <w:rFonts w:cstheme="minorHAnsi"/>
+          <w:color w:val="000000" w:themeColor="text1"/>
+          <w:sz w:val="21"/>
+          <w:szCs w:val="21"/>
+        </w:rPr>
+        <w:t xml:space="preserve">We will be using google </w:t>
+      </w:r>
+      <w:proofErr w:type="spellStart"/>
+      <w:r>
+        <w:rPr>
+          <w:rFonts w:cstheme="minorHAnsi"/>
+          <w:color w:val="000000" w:themeColor="text1"/>
+          <w:sz w:val="21"/>
+          <w:szCs w:val="21"/>
+        </w:rPr>
+        <w:t>colab</w:t>
+      </w:r>
+      <w:proofErr w:type="spellEnd"/>
+      <w:r>
+        <w:rPr>
+          <w:rFonts w:cstheme="minorHAnsi"/>
+          <w:color w:val="000000" w:themeColor="text1"/>
+          <w:sz w:val="21"/>
+          <w:szCs w:val="21"/>
+        </w:rPr>
+        <w:t xml:space="preserve"> to run the notebooks so a google account is required</w:t>
+      </w:r>
+      <w:r>
+        <w:rPr>
+          <w:rFonts w:cstheme="minorHAnsi"/>
+          <w:color w:val="000000" w:themeColor="text1"/>
+          <w:sz w:val="21"/>
+          <w:szCs w:val="21"/>
+        </w:rPr>
+        <w:t xml:space="preserve"> </w:t>
+      </w:r>
+      <w:r>
+        <w:rPr>
+          <w:rFonts w:cstheme="minorHAnsi"/>
+          <w:color w:val="000000" w:themeColor="text1"/>
+          <w:sz w:val="21"/>
+          <w:szCs w:val="21"/>
+        </w:rPr>
+        <w:t xml:space="preserve"> </w:t>
+      </w:r>
+      <w:hyperlink r:id="rId11" w:history="1">
+        <w:r>
+          <w:rPr>
+            <w:rStyle w:val="Hyperlink"/>
+            <w:rFonts w:cstheme="minorHAnsi"/>
+            <w:sz w:val="21"/>
+            <w:szCs w:val="21"/>
+            <w:u w:val="none"/>
+          </w:rPr>
+          <w:t>myaccount.google.co</w:t>
+        </w:r>
+        <w:r>
+          <w:rPr>
+            <w:rStyle w:val="Hyperlink"/>
+            <w:rFonts w:cstheme="minorHAnsi"/>
+            <w:sz w:val="21"/>
+            <w:szCs w:val="21"/>
+            <w:u w:val="none"/>
+          </w:rPr>
+          <w:t>m</w:t>
+        </w:r>
+      </w:hyperlink>
     </w:p>
     <w:p>
       <w:pPr>
@@ -1657,7 +1763,7 @@
                     <pic:cNvPicPr/>
                   </pic:nvPicPr>
                   <pic:blipFill>
-                    <a:blip r:embed="rId11" cstate="print">
+                    <a:blip r:embed="rId12" cstate="print">
                       <a:extLst>
                         <a:ext uri="{28A0092B-C50C-407E-A947-70E740481C1C}">
                           <a14:useLocalDpi xmlns:a14="http://schemas.microsoft.com/office/drawing/2010/main" val="0"/>
@@ -1739,16 +1845,16 @@
         <mc:AlternateContent>
           <mc:Choice Requires="wps">
             <w:drawing>
-              <wp:anchor distT="0" distB="0" distL="114300" distR="114300" simplePos="0" relativeHeight="251660288" behindDoc="0" locked="0" layoutInCell="1" allowOverlap="1" wp14:anchorId="7773341D" wp14:editId="7BD885D4">
+              <wp:anchor distT="0" distB="0" distL="114300" distR="114300" simplePos="0" relativeHeight="251660288" behindDoc="0" locked="0" layoutInCell="1" allowOverlap="1" wp14:anchorId="7773341D" wp14:editId="0AB2C067">
                 <wp:simplePos x="0" y="0"/>
                 <wp:positionH relativeFrom="column">
-                  <wp:posOffset>1221071</wp:posOffset>
+                  <wp:posOffset>1424030</wp:posOffset>
                 </wp:positionH>
                 <wp:positionV relativeFrom="paragraph">
-                  <wp:posOffset>118095</wp:posOffset>
+                  <wp:posOffset>128107</wp:posOffset>
                 </wp:positionV>
-                <wp:extent cx="4627841" cy="244306"/>
-                <wp:effectExtent l="0" t="0" r="0" b="0"/>
+                <wp:extent cx="2864581" cy="331774"/>
+                <wp:effectExtent l="0" t="0" r="5715" b="0"/>
                 <wp:wrapNone/>
                 <wp:docPr id="1006789257" name="Text Box 3"/>
                 <wp:cNvGraphicFramePr/>
@@ -1759,7 +1865,7 @@
                       <wps:spPr>
                         <a:xfrm>
                           <a:off x="0" y="0"/>
-                          <a:ext cx="4627841" cy="244306"/>
+                          <a:ext cx="2864581" cy="331774"/>
                         </a:xfrm>
                         <a:prstGeom prst="rect">
                           <a:avLst/>
@@ -1824,8 +1930,31 @@
                                 <w:rFonts w:cstheme="minorHAnsi"/>
                                 <w:sz w:val="21"/>
                                 <w:szCs w:val="21"/>
+                                <w:u w:val="none"/>
                               </w:rPr>
-                              <w:t>https://github.com/inlab-geo/inlab-show-and-tell-2025</w:t>
+                              <w:t>github.com/</w:t>
+                            </w:r>
+                            <w:proofErr w:type="spellStart"/>
+                            <w:r>
+                              <w:rPr>
+                                <w:rStyle w:val="Hyperlink"/>
+                                <w:rFonts w:cstheme="minorHAnsi"/>
+                                <w:sz w:val="21"/>
+                                <w:szCs w:val="21"/>
+                                <w:u w:val="none"/>
+                              </w:rPr>
+                              <w:t>inlab</w:t>
+                            </w:r>
+                            <w:proofErr w:type="spellEnd"/>
+                            <w:r>
+                              <w:rPr>
+                                <w:rStyle w:val="Hyperlink"/>
+                                <w:rFonts w:cstheme="minorHAnsi"/>
+                                <w:sz w:val="21"/>
+                                <w:szCs w:val="21"/>
+                                <w:u w:val="none"/>
+                              </w:rPr>
+                              <w:t>-geo/inlab-show-and-tell-2025</w:t>
                             </w:r>
                             <w:r>
                               <w:rPr>
@@ -1849,6 +1978,12 @@
                     </wps:wsp>
                   </a:graphicData>
                 </a:graphic>
+                <wp14:sizeRelH relativeFrom="margin">
+                  <wp14:pctWidth>0</wp14:pctWidth>
+                </wp14:sizeRelH>
+                <wp14:sizeRelV relativeFrom="margin">
+                  <wp14:pctHeight>0</wp14:pctHeight>
+                </wp14:sizeRelV>
               </wp:anchor>
             </w:drawing>
           </mc:Choice>
@@ -1858,7 +1993,7 @@
                 <v:stroke joinstyle="miter"/>
                 <v:path gradientshapeok="t" o:connecttype="rect"/>
               </v:shapetype>
-              <v:shape id="Text Box 3" o:spid="_x0000_s1026" type="#_x0000_t202" style="position:absolute;margin-left:96.15pt;margin-top:9.3pt;width:364.4pt;height:19.25pt;z-index:251660288;visibility:visible;mso-wrap-style:square;mso-wrap-distance-left:9pt;mso-wrap-distance-top:0;mso-wrap-distance-right:9pt;mso-wrap-distance-bottom:0;mso-position-horizontal:absolute;mso-position-horizontal-relative:text;mso-position-vertical:absolute;mso-position-vertical-relative:text;v-text-anchor:top" o:gfxdata="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" fillcolor="white [3201]" stroked="f" strokeweight=".5pt">
+              <v:shape id="Text Box 3" o:spid="_x0000_s1026" type="#_x0000_t202" style="position:absolute;margin-left:112.15pt;margin-top:10.1pt;width:225.55pt;height:26.1pt;z-index:251660288;visibility:visible;mso-wrap-style:square;mso-width-percent:0;mso-height-percent:0;mso-wrap-distance-left:9pt;mso-wrap-distance-top:0;mso-wrap-distance-right:9pt;mso-wrap-distance-bottom:0;mso-position-horizontal:absolute;mso-position-horizontal-relative:text;mso-position-vertical:absolute;mso-position-vertical-relative:text;mso-width-percent:0;mso-height-percent:0;mso-width-relative:margin;mso-height-relative:margin;v-text-anchor:top" o:gfxdata="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" fillcolor="white [3201]" stroked="f" strokeweight=".5pt">
                 <v:textbox>
                   <w:txbxContent>
                     <w:p>
@@ -1912,8 +2047,31 @@
                           <w:rFonts w:cstheme="minorHAnsi"/>
                           <w:sz w:val="21"/>
                           <w:szCs w:val="21"/>
+                          <w:u w:val="none"/>
                         </w:rPr>
-                        <w:t>https://github.com/inlab-geo/inlab-show-and-tell-2025</w:t>
+                        <w:t>github.com/</w:t>
+                      </w:r>
+                      <w:proofErr w:type="spellStart"/>
+                      <w:r>
+                        <w:rPr>
+                          <w:rStyle w:val="Hyperlink"/>
+                          <w:rFonts w:cstheme="minorHAnsi"/>
+                          <w:sz w:val="21"/>
+                          <w:szCs w:val="21"/>
+                          <w:u w:val="none"/>
+                        </w:rPr>
+                        <w:t>inlab</w:t>
+                      </w:r>
+                      <w:proofErr w:type="spellEnd"/>
+                      <w:r>
+                        <w:rPr>
+                          <w:rStyle w:val="Hyperlink"/>
+                          <w:rFonts w:cstheme="minorHAnsi"/>
+                          <w:sz w:val="21"/>
+                          <w:szCs w:val="21"/>
+                          <w:u w:val="none"/>
+                        </w:rPr>
+                        <w:t>-geo/inlab-show-and-tell-2025</w:t>
                       </w:r>
                       <w:r>
                         <w:rPr>
@@ -2433,7 +2591,7 @@
                                   <pic:cNvPicPr/>
                                 </pic:nvPicPr>
                                 <pic:blipFill>
-                                  <a:blip r:embed="rId1">
+                                  <a:blip r:embed="rId2">
                                     <a:extLst>
                                       <a:ext uri="{28A0092B-C50C-407E-A947-70E740481C1C}">
                                         <a14:useLocalDpi xmlns:a14="http://schemas.microsoft.com/office/drawing/2010/main" val="0"/>

</xml_diff>

<commit_message>
fix: flyer text update
</commit_message>
<xml_diff>
--- a/docs/using-cofi-to-experiment-with-geophysical-inversions.docx
+++ b/docs/using-cofi-to-experiment-with-geophysical-inversions.docx
@@ -15,7 +15,11 @@
           <w:shd w:val="clear" w:color="auto" w:fill="FFFFFF"/>
         </w:rPr>
         <w:sectPr>
-          <w:headerReference w:type="default" r:id="rId7"/>
+          <w:headerReference w:type="even" r:id="rId7"/>
+          <w:headerReference w:type="default" r:id="rId8"/>
+          <w:footerReference w:type="even" r:id="rId9"/>
+          <w:headerReference w:type="first" r:id="rId10"/>
+          <w:footerReference w:type="first" r:id="rId11"/>
           <w:pgSz w:w="11900" w:h="16840"/>
           <w:pgMar w:top="2162" w:right="1440" w:bottom="1440" w:left="1440" w:header="708" w:footer="708" w:gutter="0"/>
           <w:cols w:space="708"/>
@@ -194,7 +198,7 @@
         </w:rPr>
         <w:t xml:space="preserve"> Common Framework for Inference (</w:t>
       </w:r>
-      <w:hyperlink r:id="rId8" w:history="1">
+      <w:hyperlink r:id="rId12" w:history="1">
         <w:r>
           <w:rPr>
             <w:rStyle w:val="Hyperlink"/>
@@ -279,7 +283,7 @@
           <w:szCs w:val="21"/>
         </w:rPr>
       </w:pPr>
-      <w:hyperlink r:id="rId9" w:history="1">
+      <w:hyperlink r:id="rId13" w:history="1">
         <w:r>
           <w:rPr>
             <w:rStyle w:val="Hyperlink"/>
@@ -892,7 +896,7 @@
           <w:szCs w:val="21"/>
         </w:rPr>
       </w:pPr>
-      <w:hyperlink r:id="rId10" w:history="1">
+      <w:hyperlink r:id="rId14" w:history="1">
         <w:r>
           <w:rPr>
             <w:rStyle w:val="Hyperlink"/>
@@ -902,29 +906,7 @@
             <w:szCs w:val="21"/>
             <w:u w:val="none"/>
           </w:rPr>
-          <w:t>inla</w:t>
-        </w:r>
-        <w:r>
-          <w:rPr>
-            <w:rStyle w:val="Hyperlink"/>
-            <w:rFonts w:ascii="Calibri" w:hAnsi="Calibri" w:cs="Calibri"/>
-            <w:color w:val="2F5496" w:themeColor="accent1" w:themeShade="BF"/>
-            <w:sz w:val="21"/>
-            <w:szCs w:val="21"/>
-            <w:u w:val="none"/>
-          </w:rPr>
-          <w:t>b</w:t>
-        </w:r>
-        <w:r>
-          <w:rPr>
-            <w:rStyle w:val="Hyperlink"/>
-            <w:rFonts w:ascii="Calibri" w:hAnsi="Calibri" w:cs="Calibri"/>
-            <w:color w:val="2F5496" w:themeColor="accent1" w:themeShade="BF"/>
-            <w:sz w:val="21"/>
-            <w:szCs w:val="21"/>
-            <w:u w:val="none"/>
-          </w:rPr>
-          <w:t>.au/</w:t>
+          <w:t>inlab.au/</w:t>
         </w:r>
         <w:proofErr w:type="spellStart"/>
         <w:r>
@@ -1211,124 +1193,43 @@
         <w:pStyle w:val="ListParagraph"/>
         <w:numPr>
           <w:ilvl w:val="0"/>
-          <w:numId w:val="3"/>
+          <w:numId w:val="4"/>
         </w:numPr>
-        <w:ind w:left="709"/>
-        <w:jc w:val="both"/>
-        <w:rPr>
-          <w:rFonts w:cstheme="minorHAnsi"/>
-          <w:color w:val="000000" w:themeColor="text1"/>
-          <w:sz w:val="21"/>
-          <w:szCs w:val="21"/>
-        </w:rPr>
-      </w:pPr>
-      <w:r>
-        <w:rPr>
-          <w:rFonts w:cstheme="minorHAnsi"/>
-          <w:color w:val="000000" w:themeColor="text1"/>
-          <w:sz w:val="21"/>
-          <w:szCs w:val="21"/>
-        </w:rPr>
-        <w:t>a</w:t>
-      </w:r>
-      <w:r>
-        <w:rPr>
-          <w:rFonts w:cstheme="minorHAnsi"/>
-          <w:color w:val="000000" w:themeColor="text1"/>
-          <w:sz w:val="21"/>
-          <w:szCs w:val="21"/>
-        </w:rPr>
-        <w:t xml:space="preserve">re interested in refreshing their knowledge </w:t>
-      </w:r>
-      <w:r>
-        <w:rPr>
-          <w:rFonts w:cstheme="minorHAnsi"/>
-          <w:color w:val="000000" w:themeColor="text1"/>
-          <w:sz w:val="21"/>
-          <w:szCs w:val="21"/>
-        </w:rPr>
-        <w:t>about</w:t>
-      </w:r>
-      <w:r>
-        <w:rPr>
-          <w:rFonts w:cstheme="minorHAnsi"/>
-          <w:color w:val="000000" w:themeColor="text1"/>
-          <w:sz w:val="21"/>
-          <w:szCs w:val="21"/>
-        </w:rPr>
-        <w:t>,</w:t>
-      </w:r>
-      <w:r>
-        <w:rPr>
-          <w:rFonts w:cstheme="minorHAnsi"/>
-          <w:color w:val="000000" w:themeColor="text1"/>
-          <w:sz w:val="21"/>
-          <w:szCs w:val="21"/>
-        </w:rPr>
-        <w:t xml:space="preserve"> or have an interest </w:t>
-      </w:r>
-      <w:r>
-        <w:rPr>
-          <w:rFonts w:cstheme="minorHAnsi"/>
-          <w:color w:val="000000" w:themeColor="text1"/>
-          <w:sz w:val="21"/>
-          <w:szCs w:val="21"/>
-        </w:rPr>
-        <w:t xml:space="preserve">exploring </w:t>
-      </w:r>
-      <w:r>
-        <w:rPr>
-          <w:rFonts w:cstheme="minorHAnsi"/>
-          <w:color w:val="000000" w:themeColor="text1"/>
-          <w:sz w:val="21"/>
-          <w:szCs w:val="21"/>
-        </w:rPr>
-        <w:t>the more</w:t>
-      </w:r>
-      <w:r>
-        <w:rPr>
-          <w:rFonts w:cstheme="minorHAnsi"/>
-          <w:color w:val="000000" w:themeColor="text1"/>
-          <w:sz w:val="21"/>
-          <w:szCs w:val="21"/>
-        </w:rPr>
-        <w:t xml:space="preserve"> fundamental aspects of</w:t>
-      </w:r>
-      <w:r>
-        <w:rPr>
-          <w:rFonts w:cstheme="minorHAnsi"/>
-          <w:color w:val="000000" w:themeColor="text1"/>
-          <w:sz w:val="21"/>
-          <w:szCs w:val="21"/>
-        </w:rPr>
-        <w:t>,</w:t>
-      </w:r>
-      <w:r>
-        <w:rPr>
-          <w:rFonts w:cstheme="minorHAnsi"/>
-          <w:color w:val="000000" w:themeColor="text1"/>
-          <w:sz w:val="21"/>
-          <w:szCs w:val="21"/>
-        </w:rPr>
-        <w:t xml:space="preserve"> inverse</w:t>
-      </w:r>
-      <w:r>
-        <w:rPr>
-          <w:rFonts w:cstheme="minorHAnsi"/>
-          <w:color w:val="000000" w:themeColor="text1"/>
-          <w:sz w:val="21"/>
-          <w:szCs w:val="21"/>
-        </w:rPr>
-        <w:t xml:space="preserve"> problems</w:t>
-      </w:r>
-      <w:r>
-        <w:rPr>
-          <w:rFonts w:cstheme="minorHAnsi"/>
-          <w:color w:val="000000" w:themeColor="text1"/>
-          <w:sz w:val="21"/>
-          <w:szCs w:val="21"/>
-        </w:rPr>
-        <w:t>,</w:t>
+        <w:rPr>
+          <w:rFonts w:eastAsia="Times New Roman" w:cs="Times New Roman"/>
+          <w:sz w:val="21"/>
+          <w:szCs w:val="21"/>
+          <w:lang w:eastAsia="en-GB"/>
+        </w:rPr>
+      </w:pPr>
+      <w:r>
+        <w:rPr>
+          <w:rFonts w:eastAsia="Times New Roman" w:cs="Times New Roman"/>
+          <w:sz w:val="21"/>
+          <w:szCs w:val="21"/>
+          <w:lang w:eastAsia="en-GB"/>
+        </w:rPr>
+        <w:t xml:space="preserve">are interested in refreshing or expanding their knowledge of the fundamental aspects of inverse problems and approaches to solve </w:t>
+      </w:r>
+      <w:proofErr w:type="gramStart"/>
+      <w:r>
+        <w:rPr>
+          <w:rFonts w:eastAsia="Times New Roman" w:cs="Times New Roman"/>
+          <w:sz w:val="21"/>
+          <w:szCs w:val="21"/>
+          <w:lang w:eastAsia="en-GB"/>
+        </w:rPr>
+        <w:t>them;</w:t>
+      </w:r>
+      <w:proofErr w:type="gramEnd"/>
+      <w:r>
+        <w:rPr>
+          <w:rFonts w:eastAsia="Times New Roman" w:cs="Times New Roman"/>
+          <w:sz w:val="21"/>
+          <w:szCs w:val="21"/>
+          <w:lang w:eastAsia="en-GB"/>
+        </w:rPr>
+        <w:t xml:space="preserve"> </w:t>
       </w:r>
     </w:p>
     <w:p>
@@ -1336,108 +1237,43 @@
         <w:pStyle w:val="ListParagraph"/>
         <w:numPr>
           <w:ilvl w:val="0"/>
-          <w:numId w:val="3"/>
+          <w:numId w:val="4"/>
         </w:numPr>
-        <w:ind w:left="709"/>
-        <w:jc w:val="both"/>
-        <w:rPr>
-          <w:rFonts w:cstheme="minorHAnsi"/>
-          <w:color w:val="000000" w:themeColor="text1"/>
-          <w:sz w:val="21"/>
-          <w:szCs w:val="21"/>
-        </w:rPr>
-      </w:pPr>
-      <w:r>
-        <w:rPr>
-          <w:rFonts w:cstheme="minorHAnsi"/>
-          <w:color w:val="000000" w:themeColor="text1"/>
-          <w:sz w:val="21"/>
-          <w:szCs w:val="21"/>
-        </w:rPr>
-        <w:t xml:space="preserve">are keen to </w:t>
-      </w:r>
-      <w:r>
-        <w:rPr>
-          <w:rFonts w:cstheme="minorHAnsi"/>
-          <w:color w:val="000000" w:themeColor="text1"/>
-          <w:sz w:val="21"/>
-          <w:szCs w:val="21"/>
-        </w:rPr>
-        <w:t>see</w:t>
-      </w:r>
-      <w:r>
-        <w:rPr>
-          <w:rFonts w:cstheme="minorHAnsi"/>
-          <w:color w:val="000000" w:themeColor="text1"/>
-          <w:sz w:val="21"/>
-          <w:szCs w:val="21"/>
-        </w:rPr>
-        <w:t xml:space="preserve"> a guided tour through a subset of </w:t>
-      </w:r>
-      <w:r>
-        <w:rPr>
-          <w:rFonts w:cstheme="minorHAnsi"/>
-          <w:color w:val="000000" w:themeColor="text1"/>
-          <w:sz w:val="21"/>
-          <w:szCs w:val="21"/>
-        </w:rPr>
-        <w:t>interactive</w:t>
-      </w:r>
-      <w:r>
-        <w:rPr>
-          <w:rFonts w:cstheme="minorHAnsi"/>
-          <w:color w:val="000000" w:themeColor="text1"/>
-          <w:sz w:val="21"/>
-          <w:szCs w:val="21"/>
-        </w:rPr>
-        <w:t xml:space="preserve"> example</w:t>
-      </w:r>
-      <w:r>
-        <w:rPr>
-          <w:rFonts w:cstheme="minorHAnsi"/>
-          <w:color w:val="000000" w:themeColor="text1"/>
-          <w:sz w:val="21"/>
-          <w:szCs w:val="21"/>
-        </w:rPr>
-        <w:t>s</w:t>
-      </w:r>
-      <w:r>
-        <w:rPr>
-          <w:rFonts w:cstheme="minorHAnsi"/>
-          <w:color w:val="000000" w:themeColor="text1"/>
-          <w:sz w:val="21"/>
-          <w:szCs w:val="21"/>
-        </w:rPr>
-        <w:t xml:space="preserve"> illustrating </w:t>
+        <w:rPr>
+          <w:rFonts w:eastAsia="Times New Roman" w:cs="Times New Roman"/>
+          <w:sz w:val="21"/>
+          <w:szCs w:val="21"/>
+          <w:lang w:eastAsia="en-GB"/>
+        </w:rPr>
+      </w:pPr>
+      <w:r>
+        <w:rPr>
+          <w:rFonts w:eastAsia="Times New Roman" w:cs="Times New Roman"/>
+          <w:sz w:val="21"/>
+          <w:szCs w:val="21"/>
+          <w:lang w:eastAsia="en-GB"/>
+        </w:rPr>
+        <w:t xml:space="preserve">are keen to see a guided tour through interactive examples illustrating </w:t>
       </w:r>
       <w:proofErr w:type="spellStart"/>
       <w:r>
         <w:rPr>
-          <w:rFonts w:cstheme="minorHAnsi"/>
-          <w:color w:val="000000" w:themeColor="text1"/>
-          <w:sz w:val="21"/>
-          <w:szCs w:val="21"/>
+          <w:rFonts w:eastAsia="Times New Roman" w:cs="Times New Roman"/>
+          <w:sz w:val="21"/>
+          <w:szCs w:val="21"/>
+          <w:lang w:eastAsia="en-GB"/>
         </w:rPr>
         <w:t>CoFI</w:t>
       </w:r>
       <w:proofErr w:type="spellEnd"/>
       <w:r>
         <w:rPr>
-          <w:rFonts w:cstheme="minorHAnsi"/>
-          <w:color w:val="000000" w:themeColor="text1"/>
-          <w:sz w:val="21"/>
-          <w:szCs w:val="21"/>
-        </w:rPr>
-        <w:t>;</w:t>
-      </w:r>
-      <w:r>
-        <w:rPr>
-          <w:rFonts w:cstheme="minorHAnsi"/>
-          <w:color w:val="000000" w:themeColor="text1"/>
-          <w:sz w:val="21"/>
-          <w:szCs w:val="21"/>
-        </w:rPr>
-        <w:t xml:space="preserve"> and</w:t>
+          <w:rFonts w:eastAsia="Times New Roman" w:cs="Times New Roman"/>
+          <w:sz w:val="21"/>
+          <w:szCs w:val="21"/>
+          <w:lang w:eastAsia="en-GB"/>
+        </w:rPr>
+        <w:t xml:space="preserve">; and/or </w:t>
       </w:r>
     </w:p>
     <w:p>
@@ -1445,108 +1281,43 @@
         <w:pStyle w:val="ListParagraph"/>
         <w:numPr>
           <w:ilvl w:val="0"/>
-          <w:numId w:val="3"/>
+          <w:numId w:val="4"/>
         </w:numPr>
-        <w:ind w:left="709"/>
-        <w:jc w:val="both"/>
-        <w:rPr>
-          <w:rFonts w:cstheme="minorHAnsi"/>
-          <w:color w:val="000000" w:themeColor="text1"/>
-          <w:sz w:val="21"/>
-          <w:szCs w:val="21"/>
-        </w:rPr>
-      </w:pPr>
-      <w:r>
-        <w:rPr>
-          <w:rFonts w:cstheme="minorHAnsi"/>
-          <w:color w:val="000000" w:themeColor="text1"/>
-          <w:sz w:val="21"/>
-          <w:szCs w:val="21"/>
-        </w:rPr>
-        <w:t xml:space="preserve">are </w:t>
-      </w:r>
-      <w:r>
-        <w:rPr>
-          <w:rFonts w:cstheme="minorHAnsi"/>
-          <w:color w:val="000000" w:themeColor="text1"/>
-          <w:sz w:val="21"/>
-          <w:szCs w:val="21"/>
-        </w:rPr>
-        <w:t>eager</w:t>
-      </w:r>
-      <w:r>
-        <w:rPr>
-          <w:rFonts w:cstheme="minorHAnsi"/>
-          <w:color w:val="000000" w:themeColor="text1"/>
-          <w:sz w:val="21"/>
-          <w:szCs w:val="21"/>
-        </w:rPr>
-        <w:t xml:space="preserve"> </w:t>
-      </w:r>
-      <w:r>
-        <w:rPr>
-          <w:rFonts w:cstheme="minorHAnsi"/>
-          <w:color w:val="000000" w:themeColor="text1"/>
-          <w:sz w:val="21"/>
-          <w:szCs w:val="21"/>
-        </w:rPr>
-        <w:t>to</w:t>
-      </w:r>
-      <w:r>
-        <w:rPr>
-          <w:rFonts w:cstheme="minorHAnsi"/>
-          <w:color w:val="000000" w:themeColor="text1"/>
-          <w:sz w:val="21"/>
-          <w:szCs w:val="21"/>
-        </w:rPr>
-        <w:t xml:space="preserve"> </w:t>
-      </w:r>
-      <w:r>
-        <w:rPr>
-          <w:rFonts w:cstheme="minorHAnsi"/>
-          <w:color w:val="000000" w:themeColor="text1"/>
-          <w:sz w:val="21"/>
-          <w:szCs w:val="21"/>
-        </w:rPr>
-        <w:t>help shape</w:t>
-      </w:r>
-      <w:r>
-        <w:rPr>
-          <w:rFonts w:cstheme="minorHAnsi"/>
-          <w:color w:val="000000" w:themeColor="text1"/>
-          <w:sz w:val="21"/>
-          <w:szCs w:val="21"/>
-        </w:rPr>
-        <w:t xml:space="preserve"> </w:t>
-      </w:r>
-      <w:r>
-        <w:rPr>
-          <w:rFonts w:cstheme="minorHAnsi"/>
-          <w:color w:val="000000" w:themeColor="text1"/>
-          <w:sz w:val="21"/>
-          <w:szCs w:val="21"/>
-        </w:rPr>
-        <w:t xml:space="preserve">the future of </w:t>
+        <w:rPr>
+          <w:rFonts w:eastAsia="Times New Roman" w:cs="Times New Roman"/>
+          <w:sz w:val="21"/>
+          <w:szCs w:val="21"/>
+          <w:lang w:eastAsia="en-GB"/>
+        </w:rPr>
+      </w:pPr>
+      <w:r>
+        <w:rPr>
+          <w:rFonts w:eastAsia="Times New Roman" w:cs="Times New Roman"/>
+          <w:sz w:val="21"/>
+          <w:szCs w:val="21"/>
+          <w:lang w:eastAsia="en-GB"/>
+        </w:rPr>
+        <w:t xml:space="preserve">are eager to help shape the future of the open source </w:t>
       </w:r>
       <w:proofErr w:type="spellStart"/>
       <w:r>
         <w:rPr>
-          <w:rFonts w:cstheme="minorHAnsi"/>
-          <w:color w:val="000000" w:themeColor="text1"/>
-          <w:sz w:val="21"/>
-          <w:szCs w:val="21"/>
+          <w:rFonts w:eastAsia="Times New Roman" w:cs="Times New Roman"/>
+          <w:sz w:val="21"/>
+          <w:szCs w:val="21"/>
+          <w:lang w:eastAsia="en-GB"/>
         </w:rPr>
         <w:t>CoFI</w:t>
       </w:r>
       <w:proofErr w:type="spellEnd"/>
       <w:r>
         <w:rPr>
-          <w:rFonts w:cstheme="minorHAnsi"/>
-          <w:color w:val="000000" w:themeColor="text1"/>
-          <w:sz w:val="21"/>
-          <w:szCs w:val="21"/>
-        </w:rPr>
-        <w:t>.</w:t>
+          <w:rFonts w:eastAsia="Times New Roman" w:cs="Times New Roman"/>
+          <w:sz w:val="21"/>
+          <w:szCs w:val="21"/>
+          <w:lang w:eastAsia="en-GB"/>
+        </w:rPr>
+        <w:t xml:space="preserve"> project.</w:t>
       </w:r>
     </w:p>
     <w:p>
@@ -1697,7 +1468,7 @@
         </w:rPr>
         <w:t xml:space="preserve"> </w:t>
       </w:r>
-      <w:hyperlink r:id="rId11" w:history="1">
+      <w:hyperlink r:id="rId15" w:history="1">
         <w:r>
           <w:rPr>
             <w:rStyle w:val="Hyperlink"/>
@@ -1706,17 +1477,7 @@
             <w:szCs w:val="21"/>
             <w:u w:val="none"/>
           </w:rPr>
-          <w:t>myaccount.google.co</w:t>
-        </w:r>
-        <w:r>
-          <w:rPr>
-            <w:rStyle w:val="Hyperlink"/>
-            <w:rFonts w:cstheme="minorHAnsi"/>
-            <w:sz w:val="21"/>
-            <w:szCs w:val="21"/>
-            <w:u w:val="none"/>
-          </w:rPr>
-          <w:t>m</w:t>
+          <w:t>myaccount.google.com</w:t>
         </w:r>
       </w:hyperlink>
     </w:p>
@@ -1763,7 +1524,7 @@
                     <pic:cNvPicPr/>
                   </pic:nvPicPr>
                   <pic:blipFill>
-                    <a:blip r:embed="rId12" cstate="print">
+                    <a:blip r:embed="rId16" cstate="print">
                       <a:extLst>
                         <a:ext uri="{28A0092B-C50C-407E-A947-70E740481C1C}">
                           <a14:useLocalDpi xmlns:a14="http://schemas.microsoft.com/office/drawing/2010/main" val="0"/>
@@ -2395,6 +2156,246 @@
 </w:endnotes>
 </file>
 
+<file path=word/footer1.xml><?xml version="1.0" encoding="utf-8"?>
+<w:ftr xmlns:wpc="http://schemas.microsoft.com/office/word/2010/wordprocessingCanvas" xmlns:cx="http://schemas.microsoft.com/office/drawing/2014/chartex" xmlns:cx1="http://schemas.microsoft.com/office/drawing/2015/9/8/chartex" xmlns:cx2="http://schemas.microsoft.com/office/drawing/2015/10/21/chartex" xmlns:cx3="http://schemas.microsoft.com/office/drawing/2016/5/9/chartex" xmlns:cx4="http://schemas.microsoft.com/office/drawing/2016/5/10/chartex" xmlns:cx5="http://schemas.microsoft.com/office/drawing/2016/5/11/chartex" xmlns:cx6="http://schemas.microsoft.com/office/drawing/2016/5/12/chartex" xmlns:cx7="http://schemas.microsoft.com/office/drawing/2016/5/13/chartex" xmlns:cx8="http://schemas.microsoft.com/office/drawing/2016/5/14/chartex" xmlns:mc="http://schemas.openxmlformats.org/markup-compatibility/2006" xmlns:aink="http://schemas.microsoft.com/office/drawing/2016/ink" xmlns:am3d="http://schemas.microsoft.com/office/drawing/2017/model3d" xmlns:o="urn:schemas-microsoft-com:office:office" xmlns:oel="http://schemas.microsoft.com/office/2019/extlst" xmlns:r="http://schemas.openxmlformats.org/officeDocument/2006/relationships" xmlns:m="http://schemas.openxmlformats.org/officeDocument/2006/math" xmlns:v="urn:schemas-microsoft-com:vml" xmlns:wp14="http://schemas.microsoft.com/office/word/2010/wordprocessingDrawing" xmlns:wp="http://schemas.openxmlformats.org/drawingml/2006/wordprocessingDrawing" xmlns:w10="urn:schemas-microsoft-com:office:word" xmlns:w="http://schemas.openxmlformats.org/wordprocessingml/2006/main" xmlns:w14="http://schemas.microsoft.com/office/word/2010/wordml" xmlns:w15="http://schemas.microsoft.com/office/word/2012/wordml" xmlns:w16cex="http://schemas.microsoft.com/office/word/2018/wordml/cex" xmlns:w16cid="http://schemas.microsoft.com/office/word/2016/wordml/cid" xmlns:w16="http://schemas.microsoft.com/office/word/2018/wordml" xmlns:w16du="http://schemas.microsoft.com/office/word/2023/wordml/word16du" xmlns:w16sdtdh="http://schemas.microsoft.com/office/word/2020/wordml/sdtdatahash" xmlns:w16sdtfl="http://schemas.microsoft.com/office/word/2024/wordml/sdtformatlock" xmlns:w16se="http://schemas.microsoft.com/office/word/2015/wordml/symex" xmlns:wpg="http://schemas.microsoft.com/office/word/2010/wordprocessingGroup" xmlns:wpi="http://schemas.microsoft.com/office/word/2010/wordprocessingInk" xmlns:wne="http://schemas.microsoft.com/office/word/2006/wordml" xmlns:wps="http://schemas.microsoft.com/office/word/2010/wordprocessingShape" mc:Ignorable="w14 w15 w16se w16cid w16 w16cex w16sdtdh w16sdtfl w16du wp14">
+  <w:p>
+    <w:pPr>
+      <w:pStyle w:val="Footer"/>
+    </w:pPr>
+    <w:r>
+      <w:rPr>
+        <w:noProof/>
+      </w:rPr>
+      <mc:AlternateContent>
+        <mc:Choice Requires="wps">
+          <w:drawing>
+            <wp:anchor distT="0" distB="0" distL="0" distR="0" simplePos="0" relativeHeight="251664384" behindDoc="0" locked="0" layoutInCell="1" allowOverlap="1" wp14:anchorId="3324362A" wp14:editId="42D97D1A">
+              <wp:simplePos x="635" y="635"/>
+              <wp:positionH relativeFrom="page">
+                <wp:align>center</wp:align>
+              </wp:positionH>
+              <wp:positionV relativeFrom="page">
+                <wp:align>bottom</wp:align>
+              </wp:positionV>
+              <wp:extent cx="622300" cy="376555"/>
+              <wp:effectExtent l="0" t="0" r="0" b="0"/>
+              <wp:wrapNone/>
+              <wp:docPr id="1330095066" name="Text Box 8" descr="OFFICIAL">
+                <a:extLst xmlns:a="http://schemas.openxmlformats.org/drawingml/2006/main">
+                  <a:ext uri="{5AE41FA2-C0FF-4470-9BD4-5FADCA87CBE2}">
+                    <aclsh:classification xmlns:aclsh="http://schemas.microsoft.com/office/drawing/2020/classificationShape" classificationOutcomeType="ftr"/>
+                  </a:ext>
+                </a:extLst>
+              </wp:docPr>
+              <wp:cNvGraphicFramePr/>
+              <a:graphic xmlns:a="http://schemas.openxmlformats.org/drawingml/2006/main">
+                <a:graphicData uri="http://schemas.microsoft.com/office/word/2010/wordprocessingShape">
+                  <wps:wsp>
+                    <wps:cNvSpPr txBox="1"/>
+                    <wps:spPr>
+                      <a:xfrm>
+                        <a:off x="0" y="0"/>
+                        <a:ext cx="622300" cy="376555"/>
+                      </a:xfrm>
+                      <a:prstGeom prst="rect">
+                        <a:avLst/>
+                      </a:prstGeom>
+                      <a:noFill/>
+                      <a:ln>
+                        <a:noFill/>
+                      </a:ln>
+                    </wps:spPr>
+                    <wps:txbx>
+                      <w:txbxContent>
+                        <w:p>
+                          <w:pPr>
+                            <w:rPr>
+                              <w:rFonts w:ascii="Aptos" w:eastAsia="Aptos" w:hAnsi="Aptos" w:cs="Aptos"/>
+                              <w:noProof/>
+                              <w:color w:val="FF0000"/>
+                            </w:rPr>
+                          </w:pPr>
+                          <w:r>
+                            <w:rPr>
+                              <w:rFonts w:ascii="Aptos" w:eastAsia="Aptos" w:hAnsi="Aptos" w:cs="Aptos"/>
+                              <w:noProof/>
+                              <w:color w:val="FF0000"/>
+                            </w:rPr>
+                            <w:t>OFFICIAL</w:t>
+                          </w:r>
+                        </w:p>
+                      </w:txbxContent>
+                    </wps:txbx>
+                    <wps:bodyPr rot="0" spcFirstLastPara="0" vertOverflow="overflow" horzOverflow="overflow" vert="horz" wrap="none" lIns="0" tIns="0" rIns="0" bIns="190500" numCol="1" spcCol="0" rtlCol="0" fromWordArt="0" anchor="b" anchorCtr="0" forceAA="0" compatLnSpc="1">
+                      <a:prstTxWarp prst="textNoShape">
+                        <a:avLst/>
+                      </a:prstTxWarp>
+                      <a:spAutoFit/>
+                    </wps:bodyPr>
+                  </wps:wsp>
+                </a:graphicData>
+              </a:graphic>
+            </wp:anchor>
+          </w:drawing>
+        </mc:Choice>
+        <mc:Fallback>
+          <w:pict>
+            <v:shapetype w14:anchorId="3324362A" id="_x0000_t202" coordsize="21600,21600" o:spt="202" path="m,l,21600r21600,l21600,xe">
+              <v:stroke joinstyle="miter"/>
+              <v:path gradientshapeok="t" o:connecttype="rect"/>
+            </v:shapetype>
+            <v:shape id="Text Box 8" o:spid="_x0000_s1030" type="#_x0000_t202" alt="OFFICIAL" style="position:absolute;margin-left:0;margin-top:0;width:49pt;height:29.65pt;z-index:251664384;visibility:visible;mso-wrap-style:none;mso-wrap-distance-left:0;mso-wrap-distance-top:0;mso-wrap-distance-right:0;mso-wrap-distance-bottom:0;mso-position-horizontal:center;mso-position-horizontal-relative:page;mso-position-vertical:bottom;mso-position-vertical-relative:page;v-text-anchor:bottom" o:gfxdata="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" filled="f" stroked="f">
+              <v:textbox style="mso-fit-shape-to-text:t" inset="0,0,0,15pt">
+                <w:txbxContent>
+                  <w:p>
+                    <w:pPr>
+                      <w:rPr>
+                        <w:rFonts w:ascii="Aptos" w:eastAsia="Aptos" w:hAnsi="Aptos" w:cs="Aptos"/>
+                        <w:noProof/>
+                        <w:color w:val="FF0000"/>
+                      </w:rPr>
+                    </w:pPr>
+                    <w:r>
+                      <w:rPr>
+                        <w:rFonts w:ascii="Aptos" w:eastAsia="Aptos" w:hAnsi="Aptos" w:cs="Aptos"/>
+                        <w:noProof/>
+                        <w:color w:val="FF0000"/>
+                      </w:rPr>
+                      <w:t>OFFICIAL</w:t>
+                    </w:r>
+                  </w:p>
+                </w:txbxContent>
+              </v:textbox>
+              <w10:wrap anchorx="page" anchory="page"/>
+            </v:shape>
+          </w:pict>
+        </mc:Fallback>
+      </mc:AlternateContent>
+    </w:r>
+  </w:p>
+</w:ftr>
+</file>
+
+<file path=word/footer2.xml><?xml version="1.0" encoding="utf-8"?>
+<w:ftr xmlns:wpc="http://schemas.microsoft.com/office/word/2010/wordprocessingCanvas" xmlns:cx="http://schemas.microsoft.com/office/drawing/2014/chartex" xmlns:cx1="http://schemas.microsoft.com/office/drawing/2015/9/8/chartex" xmlns:cx2="http://schemas.microsoft.com/office/drawing/2015/10/21/chartex" xmlns:cx3="http://schemas.microsoft.com/office/drawing/2016/5/9/chartex" xmlns:cx4="http://schemas.microsoft.com/office/drawing/2016/5/10/chartex" xmlns:cx5="http://schemas.microsoft.com/office/drawing/2016/5/11/chartex" xmlns:cx6="http://schemas.microsoft.com/office/drawing/2016/5/12/chartex" xmlns:cx7="http://schemas.microsoft.com/office/drawing/2016/5/13/chartex" xmlns:cx8="http://schemas.microsoft.com/office/drawing/2016/5/14/chartex" xmlns:mc="http://schemas.openxmlformats.org/markup-compatibility/2006" xmlns:aink="http://schemas.microsoft.com/office/drawing/2016/ink" xmlns:am3d="http://schemas.microsoft.com/office/drawing/2017/model3d" xmlns:o="urn:schemas-microsoft-com:office:office" xmlns:oel="http://schemas.microsoft.com/office/2019/extlst" xmlns:r="http://schemas.openxmlformats.org/officeDocument/2006/relationships" xmlns:m="http://schemas.openxmlformats.org/officeDocument/2006/math" xmlns:v="urn:schemas-microsoft-com:vml" xmlns:wp14="http://schemas.microsoft.com/office/word/2010/wordprocessingDrawing" xmlns:wp="http://schemas.openxmlformats.org/drawingml/2006/wordprocessingDrawing" xmlns:w10="urn:schemas-microsoft-com:office:word" xmlns:w="http://schemas.openxmlformats.org/wordprocessingml/2006/main" xmlns:w14="http://schemas.microsoft.com/office/word/2010/wordml" xmlns:w15="http://schemas.microsoft.com/office/word/2012/wordml" xmlns:w16cex="http://schemas.microsoft.com/office/word/2018/wordml/cex" xmlns:w16cid="http://schemas.microsoft.com/office/word/2016/wordml/cid" xmlns:w16="http://schemas.microsoft.com/office/word/2018/wordml" xmlns:w16du="http://schemas.microsoft.com/office/word/2023/wordml/word16du" xmlns:w16sdtdh="http://schemas.microsoft.com/office/word/2020/wordml/sdtdatahash" xmlns:w16sdtfl="http://schemas.microsoft.com/office/word/2024/wordml/sdtformatlock" xmlns:w16se="http://schemas.microsoft.com/office/word/2015/wordml/symex" xmlns:wpg="http://schemas.microsoft.com/office/word/2010/wordprocessingGroup" xmlns:wpi="http://schemas.microsoft.com/office/word/2010/wordprocessingInk" xmlns:wne="http://schemas.microsoft.com/office/word/2006/wordml" xmlns:wps="http://schemas.microsoft.com/office/word/2010/wordprocessingShape" mc:Ignorable="w14 w15 w16se w16cid w16 w16cex w16sdtdh w16sdtfl w16du wp14">
+  <w:p>
+    <w:pPr>
+      <w:pStyle w:val="Footer"/>
+    </w:pPr>
+    <w:r>
+      <w:rPr>
+        <w:noProof/>
+      </w:rPr>
+      <mc:AlternateContent>
+        <mc:Choice Requires="wps">
+          <w:drawing>
+            <wp:anchor distT="0" distB="0" distL="0" distR="0" simplePos="0" relativeHeight="251663360" behindDoc="0" locked="0" layoutInCell="1" allowOverlap="1" wp14:anchorId="16635D4D" wp14:editId="38B0B869">
+              <wp:simplePos x="635" y="635"/>
+              <wp:positionH relativeFrom="page">
+                <wp:align>center</wp:align>
+              </wp:positionH>
+              <wp:positionV relativeFrom="page">
+                <wp:align>bottom</wp:align>
+              </wp:positionV>
+              <wp:extent cx="622300" cy="376555"/>
+              <wp:effectExtent l="0" t="0" r="0" b="0"/>
+              <wp:wrapNone/>
+              <wp:docPr id="671672453" name="Text Box 7" descr="OFFICIAL">
+                <a:extLst xmlns:a="http://schemas.openxmlformats.org/drawingml/2006/main">
+                  <a:ext uri="{5AE41FA2-C0FF-4470-9BD4-5FADCA87CBE2}">
+                    <aclsh:classification xmlns:aclsh="http://schemas.microsoft.com/office/drawing/2020/classificationShape" classificationOutcomeType="ftr"/>
+                  </a:ext>
+                </a:extLst>
+              </wp:docPr>
+              <wp:cNvGraphicFramePr/>
+              <a:graphic xmlns:a="http://schemas.openxmlformats.org/drawingml/2006/main">
+                <a:graphicData uri="http://schemas.microsoft.com/office/word/2010/wordprocessingShape">
+                  <wps:wsp>
+                    <wps:cNvSpPr txBox="1"/>
+                    <wps:spPr>
+                      <a:xfrm>
+                        <a:off x="0" y="0"/>
+                        <a:ext cx="622300" cy="376555"/>
+                      </a:xfrm>
+                      <a:prstGeom prst="rect">
+                        <a:avLst/>
+                      </a:prstGeom>
+                      <a:noFill/>
+                      <a:ln>
+                        <a:noFill/>
+                      </a:ln>
+                    </wps:spPr>
+                    <wps:txbx>
+                      <w:txbxContent>
+                        <w:p>
+                          <w:pPr>
+                            <w:rPr>
+                              <w:rFonts w:ascii="Aptos" w:eastAsia="Aptos" w:hAnsi="Aptos" w:cs="Aptos"/>
+                              <w:noProof/>
+                              <w:color w:val="FF0000"/>
+                            </w:rPr>
+                          </w:pPr>
+                          <w:r>
+                            <w:rPr>
+                              <w:rFonts w:ascii="Aptos" w:eastAsia="Aptos" w:hAnsi="Aptos" w:cs="Aptos"/>
+                              <w:noProof/>
+                              <w:color w:val="FF0000"/>
+                            </w:rPr>
+                            <w:t>OFFICIAL</w:t>
+                          </w:r>
+                        </w:p>
+                      </w:txbxContent>
+                    </wps:txbx>
+                    <wps:bodyPr rot="0" spcFirstLastPara="0" vertOverflow="overflow" horzOverflow="overflow" vert="horz" wrap="none" lIns="0" tIns="0" rIns="0" bIns="190500" numCol="1" spcCol="0" rtlCol="0" fromWordArt="0" anchor="b" anchorCtr="0" forceAA="0" compatLnSpc="1">
+                      <a:prstTxWarp prst="textNoShape">
+                        <a:avLst/>
+                      </a:prstTxWarp>
+                      <a:spAutoFit/>
+                    </wps:bodyPr>
+                  </wps:wsp>
+                </a:graphicData>
+              </a:graphic>
+            </wp:anchor>
+          </w:drawing>
+        </mc:Choice>
+        <mc:Fallback>
+          <w:pict>
+            <v:shapetype w14:anchorId="16635D4D" id="_x0000_t202" coordsize="21600,21600" o:spt="202" path="m,l,21600r21600,l21600,xe">
+              <v:stroke joinstyle="miter"/>
+              <v:path gradientshapeok="t" o:connecttype="rect"/>
+            </v:shapetype>
+            <v:shape id="Text Box 7" o:spid="_x0000_s1032" type="#_x0000_t202" alt="OFFICIAL" style="position:absolute;margin-left:0;margin-top:0;width:49pt;height:29.65pt;z-index:251663360;visibility:visible;mso-wrap-style:none;mso-wrap-distance-left:0;mso-wrap-distance-top:0;mso-wrap-distance-right:0;mso-wrap-distance-bottom:0;mso-position-horizontal:center;mso-position-horizontal-relative:page;mso-position-vertical:bottom;mso-position-vertical-relative:page;v-text-anchor:bottom" o:gfxdata="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" filled="f" stroked="f">
+              <v:textbox style="mso-fit-shape-to-text:t" inset="0,0,0,15pt">
+                <w:txbxContent>
+                  <w:p>
+                    <w:pPr>
+                      <w:rPr>
+                        <w:rFonts w:ascii="Aptos" w:eastAsia="Aptos" w:hAnsi="Aptos" w:cs="Aptos"/>
+                        <w:noProof/>
+                        <w:color w:val="FF0000"/>
+                      </w:rPr>
+                    </w:pPr>
+                    <w:r>
+                      <w:rPr>
+                        <w:rFonts w:ascii="Aptos" w:eastAsia="Aptos" w:hAnsi="Aptos" w:cs="Aptos"/>
+                        <w:noProof/>
+                        <w:color w:val="FF0000"/>
+                      </w:rPr>
+                      <w:t>OFFICIAL</w:t>
+                    </w:r>
+                  </w:p>
+                </w:txbxContent>
+              </v:textbox>
+              <w10:wrap anchorx="page" anchory="page"/>
+            </v:shape>
+          </w:pict>
+        </mc:Fallback>
+      </mc:AlternateContent>
+    </w:r>
+  </w:p>
+</w:ftr>
+</file>
+
 <file path=word/footnotes.xml><?xml version="1.0" encoding="utf-8"?>
 <w:footnotes xmlns:wpc="http://schemas.microsoft.com/office/word/2010/wordprocessingCanvas" xmlns:cx="http://schemas.microsoft.com/office/drawing/2014/chartex" xmlns:cx1="http://schemas.microsoft.com/office/drawing/2015/9/8/chartex" xmlns:cx2="http://schemas.microsoft.com/office/drawing/2015/10/21/chartex" xmlns:cx3="http://schemas.microsoft.com/office/drawing/2016/5/9/chartex" xmlns:cx4="http://schemas.microsoft.com/office/drawing/2016/5/10/chartex" xmlns:cx5="http://schemas.microsoft.com/office/drawing/2016/5/11/chartex" xmlns:cx6="http://schemas.microsoft.com/office/drawing/2016/5/12/chartex" xmlns:cx7="http://schemas.microsoft.com/office/drawing/2016/5/13/chartex" xmlns:cx8="http://schemas.microsoft.com/office/drawing/2016/5/14/chartex" xmlns:mc="http://schemas.openxmlformats.org/markup-compatibility/2006" xmlns:aink="http://schemas.microsoft.com/office/drawing/2016/ink" xmlns:am3d="http://schemas.microsoft.com/office/drawing/2017/model3d" xmlns:o="urn:schemas-microsoft-com:office:office" xmlns:oel="http://schemas.microsoft.com/office/2019/extlst" xmlns:r="http://schemas.openxmlformats.org/officeDocument/2006/relationships" xmlns:m="http://schemas.openxmlformats.org/officeDocument/2006/math" xmlns:v="urn:schemas-microsoft-com:vml" xmlns:wp14="http://schemas.microsoft.com/office/word/2010/wordprocessingDrawing" xmlns:wp="http://schemas.openxmlformats.org/drawingml/2006/wordprocessingDrawing" xmlns:w10="urn:schemas-microsoft-com:office:word" xmlns:w="http://schemas.openxmlformats.org/wordprocessingml/2006/main" xmlns:w14="http://schemas.microsoft.com/office/word/2010/wordml" xmlns:w15="http://schemas.microsoft.com/office/word/2012/wordml" xmlns:w16cex="http://schemas.microsoft.com/office/word/2018/wordml/cex" xmlns:w16cid="http://schemas.microsoft.com/office/word/2016/wordml/cid" xmlns:w16="http://schemas.microsoft.com/office/word/2018/wordml" xmlns:w16du="http://schemas.microsoft.com/office/word/2023/wordml/word16du" xmlns:w16sdtdh="http://schemas.microsoft.com/office/word/2020/wordml/sdtdatahash" xmlns:w16sdtfl="http://schemas.microsoft.com/office/word/2024/wordml/sdtformatlock" xmlns:w16se="http://schemas.microsoft.com/office/word/2015/wordml/symex" xmlns:wpg="http://schemas.microsoft.com/office/word/2010/wordprocessingGroup" xmlns:wpi="http://schemas.microsoft.com/office/word/2010/wordprocessingInk" xmlns:wne="http://schemas.microsoft.com/office/word/2006/wordml" xmlns:wps="http://schemas.microsoft.com/office/word/2010/wordprocessingShape" mc:Ignorable="w14 w15 w16se w16cid w16 w16cex w16sdtdh w16sdtfl w16du wp14">
   <w:footnote w:type="separator" w:id="-1">
@@ -2415,6 +2416,126 @@
 </file>
 
 <file path=word/header1.xml><?xml version="1.0" encoding="utf-8"?>
+<w:hdr xmlns:wpc="http://schemas.microsoft.com/office/word/2010/wordprocessingCanvas" xmlns:cx="http://schemas.microsoft.com/office/drawing/2014/chartex" xmlns:cx1="http://schemas.microsoft.com/office/drawing/2015/9/8/chartex" xmlns:cx2="http://schemas.microsoft.com/office/drawing/2015/10/21/chartex" xmlns:cx3="http://schemas.microsoft.com/office/drawing/2016/5/9/chartex" xmlns:cx4="http://schemas.microsoft.com/office/drawing/2016/5/10/chartex" xmlns:cx5="http://schemas.microsoft.com/office/drawing/2016/5/11/chartex" xmlns:cx6="http://schemas.microsoft.com/office/drawing/2016/5/12/chartex" xmlns:cx7="http://schemas.microsoft.com/office/drawing/2016/5/13/chartex" xmlns:cx8="http://schemas.microsoft.com/office/drawing/2016/5/14/chartex" xmlns:mc="http://schemas.openxmlformats.org/markup-compatibility/2006" xmlns:aink="http://schemas.microsoft.com/office/drawing/2016/ink" xmlns:am3d="http://schemas.microsoft.com/office/drawing/2017/model3d" xmlns:o="urn:schemas-microsoft-com:office:office" xmlns:oel="http://schemas.microsoft.com/office/2019/extlst" xmlns:r="http://schemas.openxmlformats.org/officeDocument/2006/relationships" xmlns:m="http://schemas.openxmlformats.org/officeDocument/2006/math" xmlns:v="urn:schemas-microsoft-com:vml" xmlns:wp14="http://schemas.microsoft.com/office/word/2010/wordprocessingDrawing" xmlns:wp="http://schemas.openxmlformats.org/drawingml/2006/wordprocessingDrawing" xmlns:w10="urn:schemas-microsoft-com:office:word" xmlns:w="http://schemas.openxmlformats.org/wordprocessingml/2006/main" xmlns:w14="http://schemas.microsoft.com/office/word/2010/wordml" xmlns:w15="http://schemas.microsoft.com/office/word/2012/wordml" xmlns:w16cex="http://schemas.microsoft.com/office/word/2018/wordml/cex" xmlns:w16cid="http://schemas.microsoft.com/office/word/2016/wordml/cid" xmlns:w16="http://schemas.microsoft.com/office/word/2018/wordml" xmlns:w16du="http://schemas.microsoft.com/office/word/2023/wordml/word16du" xmlns:w16sdtdh="http://schemas.microsoft.com/office/word/2020/wordml/sdtdatahash" xmlns:w16sdtfl="http://schemas.microsoft.com/office/word/2024/wordml/sdtformatlock" xmlns:w16se="http://schemas.microsoft.com/office/word/2015/wordml/symex" xmlns:wpg="http://schemas.microsoft.com/office/word/2010/wordprocessingGroup" xmlns:wpi="http://schemas.microsoft.com/office/word/2010/wordprocessingInk" xmlns:wne="http://schemas.microsoft.com/office/word/2006/wordml" xmlns:wps="http://schemas.microsoft.com/office/word/2010/wordprocessingShape" mc:Ignorable="w14 w15 w16se w16cid w16 w16cex w16sdtdh w16sdtfl w16du wp14">
+  <w:p>
+    <w:pPr>
+      <w:pStyle w:val="Header"/>
+    </w:pPr>
+    <w:r>
+      <w:rPr>
+        <w:noProof/>
+      </w:rPr>
+      <mc:AlternateContent>
+        <mc:Choice Requires="wps">
+          <w:drawing>
+            <wp:anchor distT="0" distB="0" distL="0" distR="0" simplePos="0" relativeHeight="251661312" behindDoc="0" locked="0" layoutInCell="1" allowOverlap="1" wp14:anchorId="2C009B64" wp14:editId="0CF0BB91">
+              <wp:simplePos x="635" y="635"/>
+              <wp:positionH relativeFrom="page">
+                <wp:align>center</wp:align>
+              </wp:positionH>
+              <wp:positionV relativeFrom="page">
+                <wp:align>top</wp:align>
+              </wp:positionV>
+              <wp:extent cx="622300" cy="376555"/>
+              <wp:effectExtent l="0" t="0" r="0" b="4445"/>
+              <wp:wrapNone/>
+              <wp:docPr id="1036088049" name="Text Box 5" descr="OFFICIAL">
+                <a:extLst xmlns:a="http://schemas.openxmlformats.org/drawingml/2006/main">
+                  <a:ext uri="{5AE41FA2-C0FF-4470-9BD4-5FADCA87CBE2}">
+                    <aclsh:classification xmlns:aclsh="http://schemas.microsoft.com/office/drawing/2020/classificationShape" classificationOutcomeType="hdr"/>
+                  </a:ext>
+                </a:extLst>
+              </wp:docPr>
+              <wp:cNvGraphicFramePr/>
+              <a:graphic xmlns:a="http://schemas.openxmlformats.org/drawingml/2006/main">
+                <a:graphicData uri="http://schemas.microsoft.com/office/word/2010/wordprocessingShape">
+                  <wps:wsp>
+                    <wps:cNvSpPr txBox="1"/>
+                    <wps:spPr>
+                      <a:xfrm>
+                        <a:off x="0" y="0"/>
+                        <a:ext cx="622300" cy="376555"/>
+                      </a:xfrm>
+                      <a:prstGeom prst="rect">
+                        <a:avLst/>
+                      </a:prstGeom>
+                      <a:noFill/>
+                      <a:ln>
+                        <a:noFill/>
+                      </a:ln>
+                    </wps:spPr>
+                    <wps:txbx>
+                      <w:txbxContent>
+                        <w:p>
+                          <w:pPr>
+                            <w:rPr>
+                              <w:rFonts w:ascii="Aptos" w:eastAsia="Aptos" w:hAnsi="Aptos" w:cs="Aptos"/>
+                              <w:noProof/>
+                              <w:color w:val="FF0000"/>
+                            </w:rPr>
+                          </w:pPr>
+                          <w:r>
+                            <w:rPr>
+                              <w:rFonts w:ascii="Aptos" w:eastAsia="Aptos" w:hAnsi="Aptos" w:cs="Aptos"/>
+                              <w:noProof/>
+                              <w:color w:val="FF0000"/>
+                            </w:rPr>
+                            <w:t>OFFICIAL</w:t>
+                          </w:r>
+                        </w:p>
+                      </w:txbxContent>
+                    </wps:txbx>
+                    <wps:bodyPr rot="0" spcFirstLastPara="0" vertOverflow="overflow" horzOverflow="overflow" vert="horz" wrap="none" lIns="0" tIns="190500" rIns="0" bIns="0" numCol="1" spcCol="0" rtlCol="0" fromWordArt="0" anchor="t" anchorCtr="0" forceAA="0" compatLnSpc="1">
+                      <a:prstTxWarp prst="textNoShape">
+                        <a:avLst/>
+                      </a:prstTxWarp>
+                      <a:spAutoFit/>
+                    </wps:bodyPr>
+                  </wps:wsp>
+                </a:graphicData>
+              </a:graphic>
+            </wp:anchor>
+          </w:drawing>
+        </mc:Choice>
+        <mc:Fallback>
+          <w:pict>
+            <v:shapetype w14:anchorId="2C009B64" id="_x0000_t202" coordsize="21600,21600" o:spt="202" path="m,l,21600r21600,l21600,xe">
+              <v:stroke joinstyle="miter"/>
+              <v:path gradientshapeok="t" o:connecttype="rect"/>
+            </v:shapetype>
+            <v:shape id="Text Box 5" o:spid="_x0000_s1028" type="#_x0000_t202" alt="OFFICIAL" style="position:absolute;margin-left:0;margin-top:0;width:49pt;height:29.65pt;z-index:251661312;visibility:visible;mso-wrap-style:none;mso-wrap-distance-left:0;mso-wrap-distance-top:0;mso-wrap-distance-right:0;mso-wrap-distance-bottom:0;mso-position-horizontal:center;mso-position-horizontal-relative:page;mso-position-vertical:top;mso-position-vertical-relative:page;v-text-anchor:top" o:gfxdata="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" filled="f" stroked="f">
+              <v:textbox style="mso-fit-shape-to-text:t" inset="0,15pt,0,0">
+                <w:txbxContent>
+                  <w:p>
+                    <w:pPr>
+                      <w:rPr>
+                        <w:rFonts w:ascii="Aptos" w:eastAsia="Aptos" w:hAnsi="Aptos" w:cs="Aptos"/>
+                        <w:noProof/>
+                        <w:color w:val="FF0000"/>
+                      </w:rPr>
+                    </w:pPr>
+                    <w:r>
+                      <w:rPr>
+                        <w:rFonts w:ascii="Aptos" w:eastAsia="Aptos" w:hAnsi="Aptos" w:cs="Aptos"/>
+                        <w:noProof/>
+                        <w:color w:val="FF0000"/>
+                      </w:rPr>
+                      <w:t>OFFICIAL</w:t>
+                    </w:r>
+                  </w:p>
+                </w:txbxContent>
+              </v:textbox>
+              <w10:wrap anchorx="page" anchory="page"/>
+            </v:shape>
+          </w:pict>
+        </mc:Fallback>
+      </mc:AlternateContent>
+    </w:r>
+  </w:p>
+</w:hdr>
+</file>
+
+<file path=word/header2.xml><?xml version="1.0" encoding="utf-8"?>
 <w:hdr xmlns:wpc="http://schemas.microsoft.com/office/word/2010/wordprocessingCanvas" xmlns:cx="http://schemas.microsoft.com/office/drawing/2014/chartex" xmlns:cx1="http://schemas.microsoft.com/office/drawing/2015/9/8/chartex" xmlns:cx2="http://schemas.microsoft.com/office/drawing/2015/10/21/chartex" xmlns:cx3="http://schemas.microsoft.com/office/drawing/2016/5/9/chartex" xmlns:cx4="http://schemas.microsoft.com/office/drawing/2016/5/10/chartex" xmlns:cx5="http://schemas.microsoft.com/office/drawing/2016/5/11/chartex" xmlns:cx6="http://schemas.microsoft.com/office/drawing/2016/5/12/chartex" xmlns:cx7="http://schemas.microsoft.com/office/drawing/2016/5/13/chartex" xmlns:cx8="http://schemas.microsoft.com/office/drawing/2016/5/14/chartex" xmlns:mc="http://schemas.openxmlformats.org/markup-compatibility/2006" xmlns:aink="http://schemas.microsoft.com/office/drawing/2016/ink" xmlns:am3d="http://schemas.microsoft.com/office/drawing/2017/model3d" xmlns:o="urn:schemas-microsoft-com:office:office" xmlns:oel="http://schemas.microsoft.com/office/2019/extlst" xmlns:r="http://schemas.openxmlformats.org/officeDocument/2006/relationships" xmlns:m="http://schemas.openxmlformats.org/officeDocument/2006/math" xmlns:v="urn:schemas-microsoft-com:vml" xmlns:wp14="http://schemas.microsoft.com/office/word/2010/wordprocessingDrawing" xmlns:wp="http://schemas.openxmlformats.org/drawingml/2006/wordprocessingDrawing" xmlns:w10="urn:schemas-microsoft-com:office:word" xmlns:w="http://schemas.openxmlformats.org/wordprocessingml/2006/main" xmlns:w14="http://schemas.microsoft.com/office/word/2010/wordml" xmlns:w15="http://schemas.microsoft.com/office/word/2012/wordml" xmlns:w16cex="http://schemas.microsoft.com/office/word/2018/wordml/cex" xmlns:w16cid="http://schemas.microsoft.com/office/word/2016/wordml/cid" xmlns:w16="http://schemas.microsoft.com/office/word/2018/wordml" xmlns:w16du="http://schemas.microsoft.com/office/word/2023/wordml/word16du" xmlns:w16sdtdh="http://schemas.microsoft.com/office/word/2020/wordml/sdtdatahash" xmlns:w16sdtfl="http://schemas.microsoft.com/office/word/2024/wordml/sdtformatlock" xmlns:w16se="http://schemas.microsoft.com/office/word/2015/wordml/symex" xmlns:wpg="http://schemas.microsoft.com/office/word/2010/wordprocessingGroup" xmlns:wpi="http://schemas.microsoft.com/office/word/2010/wordprocessingInk" xmlns:wne="http://schemas.microsoft.com/office/word/2006/wordml" xmlns:wps="http://schemas.microsoft.com/office/word/2010/wordprocessingShape" mc:Ignorable="w14 w15 w16se w16cid w16 w16cex w16sdtdh w16sdtfl w16du wp14">
   <w:p>
     <w:pPr>
@@ -2567,7 +2688,7 @@
               <v:stroke joinstyle="miter"/>
               <v:path gradientshapeok="t" o:connecttype="rect"/>
             </v:shapetype>
-            <v:shape id="_x0000_s1028" type="#_x0000_t202" style="position:absolute;margin-left:337.4pt;margin-top:-9.3pt;width:194.8pt;height:72.7pt;z-index:251659264;visibility:visible;mso-wrap-style:square;mso-width-percent:0;mso-height-percent:0;mso-wrap-distance-left:9pt;mso-wrap-distance-top:0;mso-wrap-distance-right:9pt;mso-wrap-distance-bottom:0;mso-position-horizontal:absolute;mso-position-horizontal-relative:text;mso-position-vertical:absolute;mso-position-vertical-relative:text;mso-width-percent:0;mso-height-percent:0;mso-width-relative:margin;mso-height-relative:margin;v-text-anchor:top" o:gfxdata="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" fillcolor="white [3201]" stroked="f" strokeweight=".5pt">
+            <v:shape id="_x0000_s1029" type="#_x0000_t202" style="position:absolute;margin-left:337.4pt;margin-top:-9.3pt;width:194.8pt;height:72.7pt;z-index:251659264;visibility:visible;mso-wrap-style:square;mso-width-percent:0;mso-height-percent:0;mso-wrap-distance-left:9pt;mso-wrap-distance-top:0;mso-wrap-distance-right:9pt;mso-wrap-distance-bottom:0;mso-position-horizontal:absolute;mso-position-horizontal-relative:text;mso-position-vertical:absolute;mso-position-vertical-relative:text;mso-width-percent:0;mso-height-percent:0;mso-width-relative:margin;mso-height-relative:margin;v-text-anchor:top" o:gfxdata="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" fillcolor="white [3201]" stroked="f" strokeweight=".5pt">
               <v:textbox>
                 <w:txbxContent>
                   <w:p>
@@ -2591,7 +2712,7 @@
                                   <pic:cNvPicPr/>
                                 </pic:nvPicPr>
                                 <pic:blipFill>
-                                  <a:blip r:embed="rId2">
+                                  <a:blip r:embed="rId1">
                                     <a:extLst>
                                       <a:ext uri="{28A0092B-C50C-407E-A947-70E740481C1C}">
                                         <a14:useLocalDpi xmlns:a14="http://schemas.microsoft.com/office/drawing/2010/main" val="0"/>
@@ -2732,6 +2853,126 @@
 </w:hdr>
 </file>
 
+<file path=word/header3.xml><?xml version="1.0" encoding="utf-8"?>
+<w:hdr xmlns:wpc="http://schemas.microsoft.com/office/word/2010/wordprocessingCanvas" xmlns:cx="http://schemas.microsoft.com/office/drawing/2014/chartex" xmlns:cx1="http://schemas.microsoft.com/office/drawing/2015/9/8/chartex" xmlns:cx2="http://schemas.microsoft.com/office/drawing/2015/10/21/chartex" xmlns:cx3="http://schemas.microsoft.com/office/drawing/2016/5/9/chartex" xmlns:cx4="http://schemas.microsoft.com/office/drawing/2016/5/10/chartex" xmlns:cx5="http://schemas.microsoft.com/office/drawing/2016/5/11/chartex" xmlns:cx6="http://schemas.microsoft.com/office/drawing/2016/5/12/chartex" xmlns:cx7="http://schemas.microsoft.com/office/drawing/2016/5/13/chartex" xmlns:cx8="http://schemas.microsoft.com/office/drawing/2016/5/14/chartex" xmlns:mc="http://schemas.openxmlformats.org/markup-compatibility/2006" xmlns:aink="http://schemas.microsoft.com/office/drawing/2016/ink" xmlns:am3d="http://schemas.microsoft.com/office/drawing/2017/model3d" xmlns:o="urn:schemas-microsoft-com:office:office" xmlns:oel="http://schemas.microsoft.com/office/2019/extlst" xmlns:r="http://schemas.openxmlformats.org/officeDocument/2006/relationships" xmlns:m="http://schemas.openxmlformats.org/officeDocument/2006/math" xmlns:v="urn:schemas-microsoft-com:vml" xmlns:wp14="http://schemas.microsoft.com/office/word/2010/wordprocessingDrawing" xmlns:wp="http://schemas.openxmlformats.org/drawingml/2006/wordprocessingDrawing" xmlns:w10="urn:schemas-microsoft-com:office:word" xmlns:w="http://schemas.openxmlformats.org/wordprocessingml/2006/main" xmlns:w14="http://schemas.microsoft.com/office/word/2010/wordml" xmlns:w15="http://schemas.microsoft.com/office/word/2012/wordml" xmlns:w16cex="http://schemas.microsoft.com/office/word/2018/wordml/cex" xmlns:w16cid="http://schemas.microsoft.com/office/word/2016/wordml/cid" xmlns:w16="http://schemas.microsoft.com/office/word/2018/wordml" xmlns:w16du="http://schemas.microsoft.com/office/word/2023/wordml/word16du" xmlns:w16sdtdh="http://schemas.microsoft.com/office/word/2020/wordml/sdtdatahash" xmlns:w16sdtfl="http://schemas.microsoft.com/office/word/2024/wordml/sdtformatlock" xmlns:w16se="http://schemas.microsoft.com/office/word/2015/wordml/symex" xmlns:wpg="http://schemas.microsoft.com/office/word/2010/wordprocessingGroup" xmlns:wpi="http://schemas.microsoft.com/office/word/2010/wordprocessingInk" xmlns:wne="http://schemas.microsoft.com/office/word/2006/wordml" xmlns:wps="http://schemas.microsoft.com/office/word/2010/wordprocessingShape" mc:Ignorable="w14 w15 w16se w16cid w16 w16cex w16sdtdh w16sdtfl w16du wp14">
+  <w:p>
+    <w:pPr>
+      <w:pStyle w:val="Header"/>
+    </w:pPr>
+    <w:r>
+      <w:rPr>
+        <w:noProof/>
+      </w:rPr>
+      <mc:AlternateContent>
+        <mc:Choice Requires="wps">
+          <w:drawing>
+            <wp:anchor distT="0" distB="0" distL="0" distR="0" simplePos="0" relativeHeight="251660288" behindDoc="0" locked="0" layoutInCell="1" allowOverlap="1" wp14:anchorId="4E351DA2" wp14:editId="05FB8E49">
+              <wp:simplePos x="635" y="635"/>
+              <wp:positionH relativeFrom="page">
+                <wp:align>center</wp:align>
+              </wp:positionH>
+              <wp:positionV relativeFrom="page">
+                <wp:align>top</wp:align>
+              </wp:positionV>
+              <wp:extent cx="622300" cy="376555"/>
+              <wp:effectExtent l="0" t="0" r="0" b="4445"/>
+              <wp:wrapNone/>
+              <wp:docPr id="496328744" name="Text Box 4" descr="OFFICIAL">
+                <a:extLst xmlns:a="http://schemas.openxmlformats.org/drawingml/2006/main">
+                  <a:ext uri="{5AE41FA2-C0FF-4470-9BD4-5FADCA87CBE2}">
+                    <aclsh:classification xmlns:aclsh="http://schemas.microsoft.com/office/drawing/2020/classificationShape" classificationOutcomeType="hdr"/>
+                  </a:ext>
+                </a:extLst>
+              </wp:docPr>
+              <wp:cNvGraphicFramePr/>
+              <a:graphic xmlns:a="http://schemas.openxmlformats.org/drawingml/2006/main">
+                <a:graphicData uri="http://schemas.microsoft.com/office/word/2010/wordprocessingShape">
+                  <wps:wsp>
+                    <wps:cNvSpPr txBox="1"/>
+                    <wps:spPr>
+                      <a:xfrm>
+                        <a:off x="0" y="0"/>
+                        <a:ext cx="622300" cy="376555"/>
+                      </a:xfrm>
+                      <a:prstGeom prst="rect">
+                        <a:avLst/>
+                      </a:prstGeom>
+                      <a:noFill/>
+                      <a:ln>
+                        <a:noFill/>
+                      </a:ln>
+                    </wps:spPr>
+                    <wps:txbx>
+                      <w:txbxContent>
+                        <w:p>
+                          <w:pPr>
+                            <w:rPr>
+                              <w:rFonts w:ascii="Aptos" w:eastAsia="Aptos" w:hAnsi="Aptos" w:cs="Aptos"/>
+                              <w:noProof/>
+                              <w:color w:val="FF0000"/>
+                            </w:rPr>
+                          </w:pPr>
+                          <w:r>
+                            <w:rPr>
+                              <w:rFonts w:ascii="Aptos" w:eastAsia="Aptos" w:hAnsi="Aptos" w:cs="Aptos"/>
+                              <w:noProof/>
+                              <w:color w:val="FF0000"/>
+                            </w:rPr>
+                            <w:t>OFFICIAL</w:t>
+                          </w:r>
+                        </w:p>
+                      </w:txbxContent>
+                    </wps:txbx>
+                    <wps:bodyPr rot="0" spcFirstLastPara="0" vertOverflow="overflow" horzOverflow="overflow" vert="horz" wrap="none" lIns="0" tIns="190500" rIns="0" bIns="0" numCol="1" spcCol="0" rtlCol="0" fromWordArt="0" anchor="t" anchorCtr="0" forceAA="0" compatLnSpc="1">
+                      <a:prstTxWarp prst="textNoShape">
+                        <a:avLst/>
+                      </a:prstTxWarp>
+                      <a:spAutoFit/>
+                    </wps:bodyPr>
+                  </wps:wsp>
+                </a:graphicData>
+              </a:graphic>
+            </wp:anchor>
+          </w:drawing>
+        </mc:Choice>
+        <mc:Fallback>
+          <w:pict>
+            <v:shapetype w14:anchorId="4E351DA2" id="_x0000_t202" coordsize="21600,21600" o:spt="202" path="m,l,21600r21600,l21600,xe">
+              <v:stroke joinstyle="miter"/>
+              <v:path gradientshapeok="t" o:connecttype="rect"/>
+            </v:shapetype>
+            <v:shape id="Text Box 4" o:spid="_x0000_s1031" type="#_x0000_t202" alt="OFFICIAL" style="position:absolute;margin-left:0;margin-top:0;width:49pt;height:29.65pt;z-index:251660288;visibility:visible;mso-wrap-style:none;mso-wrap-distance-left:0;mso-wrap-distance-top:0;mso-wrap-distance-right:0;mso-wrap-distance-bottom:0;mso-position-horizontal:center;mso-position-horizontal-relative:page;mso-position-vertical:top;mso-position-vertical-relative:page;v-text-anchor:top" o:gfxdata="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" filled="f" stroked="f">
+              <v:textbox style="mso-fit-shape-to-text:t" inset="0,15pt,0,0">
+                <w:txbxContent>
+                  <w:p>
+                    <w:pPr>
+                      <w:rPr>
+                        <w:rFonts w:ascii="Aptos" w:eastAsia="Aptos" w:hAnsi="Aptos" w:cs="Aptos"/>
+                        <w:noProof/>
+                        <w:color w:val="FF0000"/>
+                      </w:rPr>
+                    </w:pPr>
+                    <w:r>
+                      <w:rPr>
+                        <w:rFonts w:ascii="Aptos" w:eastAsia="Aptos" w:hAnsi="Aptos" w:cs="Aptos"/>
+                        <w:noProof/>
+                        <w:color w:val="FF0000"/>
+                      </w:rPr>
+                      <w:t>OFFICIAL</w:t>
+                    </w:r>
+                  </w:p>
+                </w:txbxContent>
+              </v:textbox>
+              <w10:wrap anchorx="page" anchory="page"/>
+            </v:shape>
+          </w:pict>
+        </mc:Fallback>
+      </mc:AlternateContent>
+    </w:r>
+  </w:p>
+</w:hdr>
+</file>
+
 <file path=word/numbering.xml><?xml version="1.0" encoding="utf-8"?>
 <w:numbering xmlns:wpc="http://schemas.microsoft.com/office/word/2010/wordprocessingCanvas" xmlns:cx="http://schemas.microsoft.com/office/drawing/2014/chartex" xmlns:cx1="http://schemas.microsoft.com/office/drawing/2015/9/8/chartex" xmlns:cx2="http://schemas.microsoft.com/office/drawing/2015/10/21/chartex" xmlns:cx3="http://schemas.microsoft.com/office/drawing/2016/5/9/chartex" xmlns:cx4="http://schemas.microsoft.com/office/drawing/2016/5/10/chartex" xmlns:cx5="http://schemas.microsoft.com/office/drawing/2016/5/11/chartex" xmlns:cx6="http://schemas.microsoft.com/office/drawing/2016/5/12/chartex" xmlns:cx7="http://schemas.microsoft.com/office/drawing/2016/5/13/chartex" xmlns:cx8="http://schemas.microsoft.com/office/drawing/2016/5/14/chartex" xmlns:mc="http://schemas.openxmlformats.org/markup-compatibility/2006" xmlns:aink="http://schemas.microsoft.com/office/drawing/2016/ink" xmlns:am3d="http://schemas.microsoft.com/office/drawing/2017/model3d" xmlns:o="urn:schemas-microsoft-com:office:office" xmlns:oel="http://schemas.microsoft.com/office/2019/extlst" xmlns:r="http://schemas.openxmlformats.org/officeDocument/2006/relationships" xmlns:m="http://schemas.openxmlformats.org/officeDocument/2006/math" xmlns:v="urn:schemas-microsoft-com:vml" xmlns:wp14="http://schemas.microsoft.com/office/word/2010/wordprocessingDrawing" xmlns:wp="http://schemas.openxmlformats.org/drawingml/2006/wordprocessingDrawing" xmlns:w10="urn:schemas-microsoft-com:office:word" xmlns:w="http://schemas.openxmlformats.org/wordprocessingml/2006/main" xmlns:w14="http://schemas.microsoft.com/office/word/2010/wordml" xmlns:w15="http://schemas.microsoft.com/office/word/2012/wordml" xmlns:w16cex="http://schemas.microsoft.com/office/word/2018/wordml/cex" xmlns:w16cid="http://schemas.microsoft.com/office/word/2016/wordml/cid" xmlns:w16="http://schemas.microsoft.com/office/word/2018/wordml" xmlns:w16du="http://schemas.microsoft.com/office/word/2023/wordml/word16du" xmlns:w16sdtdh="http://schemas.microsoft.com/office/word/2020/wordml/sdtdatahash" xmlns:w16sdtfl="http://schemas.microsoft.com/office/word/2024/wordml/sdtformatlock" xmlns:w16se="http://schemas.microsoft.com/office/word/2015/wordml/symex" xmlns:wpg="http://schemas.microsoft.com/office/word/2010/wordprocessingGroup" xmlns:wpi="http://schemas.microsoft.com/office/word/2010/wordprocessingInk" xmlns:wne="http://schemas.microsoft.com/office/word/2006/wordml" xmlns:wps="http://schemas.microsoft.com/office/word/2010/wordprocessingShape" mc:Ignorable="w14 w15 w16se w16cid w16 w16cex w16sdtdh w16sdtfl w16du wp14">
   <w:abstractNum w:abstractNumId="0" w15:restartNumberingAfterBreak="0">
@@ -2960,6 +3201,119 @@
     </w:lvl>
   </w:abstractNum>
   <w:abstractNum w:abstractNumId="2" w15:restartNumberingAfterBreak="0">
+    <w:nsid w:val="3CA305AC"/>
+    <w:multiLevelType w:val="hybridMultilevel"/>
+    <w:tmpl w:val="A6B0608A"/>
+    <w:lvl w:ilvl="0" w:tplc="08090001">
+      <w:start w:val="1"/>
+      <w:numFmt w:val="bullet"/>
+      <w:lvlText w:val=""/>
+      <w:lvlJc w:val="left"/>
+      <w:pPr>
+        <w:ind w:left="720" w:hanging="360"/>
+      </w:pPr>
+      <w:rPr>
+        <w:rFonts w:ascii="Symbol" w:hAnsi="Symbol" w:hint="default"/>
+      </w:rPr>
+    </w:lvl>
+    <w:lvl w:ilvl="1" w:tplc="08090003" w:tentative="1">
+      <w:start w:val="1"/>
+      <w:numFmt w:val="bullet"/>
+      <w:lvlText w:val="o"/>
+      <w:lvlJc w:val="left"/>
+      <w:pPr>
+        <w:ind w:left="1440" w:hanging="360"/>
+      </w:pPr>
+      <w:rPr>
+        <w:rFonts w:ascii="Courier New" w:hAnsi="Courier New" w:cs="Courier New" w:hint="default"/>
+      </w:rPr>
+    </w:lvl>
+    <w:lvl w:ilvl="2" w:tplc="08090005" w:tentative="1">
+      <w:start w:val="1"/>
+      <w:numFmt w:val="bullet"/>
+      <w:lvlText w:val=""/>
+      <w:lvlJc w:val="left"/>
+      <w:pPr>
+        <w:ind w:left="2160" w:hanging="360"/>
+      </w:pPr>
+      <w:rPr>
+        <w:rFonts w:ascii="Wingdings" w:hAnsi="Wingdings" w:hint="default"/>
+      </w:rPr>
+    </w:lvl>
+    <w:lvl w:ilvl="3" w:tplc="08090001" w:tentative="1">
+      <w:start w:val="1"/>
+      <w:numFmt w:val="bullet"/>
+      <w:lvlText w:val=""/>
+      <w:lvlJc w:val="left"/>
+      <w:pPr>
+        <w:ind w:left="2880" w:hanging="360"/>
+      </w:pPr>
+      <w:rPr>
+        <w:rFonts w:ascii="Symbol" w:hAnsi="Symbol" w:hint="default"/>
+      </w:rPr>
+    </w:lvl>
+    <w:lvl w:ilvl="4" w:tplc="08090003" w:tentative="1">
+      <w:start w:val="1"/>
+      <w:numFmt w:val="bullet"/>
+      <w:lvlText w:val="o"/>
+      <w:lvlJc w:val="left"/>
+      <w:pPr>
+        <w:ind w:left="3600" w:hanging="360"/>
+      </w:pPr>
+      <w:rPr>
+        <w:rFonts w:ascii="Courier New" w:hAnsi="Courier New" w:cs="Courier New" w:hint="default"/>
+      </w:rPr>
+    </w:lvl>
+    <w:lvl w:ilvl="5" w:tplc="08090005" w:tentative="1">
+      <w:start w:val="1"/>
+      <w:numFmt w:val="bullet"/>
+      <w:lvlText w:val=""/>
+      <w:lvlJc w:val="left"/>
+      <w:pPr>
+        <w:ind w:left="4320" w:hanging="360"/>
+      </w:pPr>
+      <w:rPr>
+        <w:rFonts w:ascii="Wingdings" w:hAnsi="Wingdings" w:hint="default"/>
+      </w:rPr>
+    </w:lvl>
+    <w:lvl w:ilvl="6" w:tplc="08090001" w:tentative="1">
+      <w:start w:val="1"/>
+      <w:numFmt w:val="bullet"/>
+      <w:lvlText w:val=""/>
+      <w:lvlJc w:val="left"/>
+      <w:pPr>
+        <w:ind w:left="5040" w:hanging="360"/>
+      </w:pPr>
+      <w:rPr>
+        <w:rFonts w:ascii="Symbol" w:hAnsi="Symbol" w:hint="default"/>
+      </w:rPr>
+    </w:lvl>
+    <w:lvl w:ilvl="7" w:tplc="08090003" w:tentative="1">
+      <w:start w:val="1"/>
+      <w:numFmt w:val="bullet"/>
+      <w:lvlText w:val="o"/>
+      <w:lvlJc w:val="left"/>
+      <w:pPr>
+        <w:ind w:left="5760" w:hanging="360"/>
+      </w:pPr>
+      <w:rPr>
+        <w:rFonts w:ascii="Courier New" w:hAnsi="Courier New" w:cs="Courier New" w:hint="default"/>
+      </w:rPr>
+    </w:lvl>
+    <w:lvl w:ilvl="8" w:tplc="08090005" w:tentative="1">
+      <w:start w:val="1"/>
+      <w:numFmt w:val="bullet"/>
+      <w:lvlText w:val=""/>
+      <w:lvlJc w:val="left"/>
+      <w:pPr>
+        <w:ind w:left="6480" w:hanging="360"/>
+      </w:pPr>
+      <w:rPr>
+        <w:rFonts w:ascii="Wingdings" w:hAnsi="Wingdings" w:hint="default"/>
+      </w:rPr>
+    </w:lvl>
+  </w:abstractNum>
+  <w:abstractNum w:abstractNumId="3" w15:restartNumberingAfterBreak="0">
     <w:nsid w:val="45C724E4"/>
     <w:multiLevelType w:val="hybridMultilevel"/>
     <w:tmpl w:val="CA5A6030"/>
@@ -3073,13 +3427,16 @@
     </w:lvl>
   </w:abstractNum>
   <w:num w:numId="1" w16cid:durableId="1355377762">
-    <w:abstractNumId w:val="2"/>
+    <w:abstractNumId w:val="3"/>
   </w:num>
   <w:num w:numId="2" w16cid:durableId="532158474">
     <w:abstractNumId w:val="1"/>
   </w:num>
   <w:num w:numId="3" w16cid:durableId="1359354519">
     <w:abstractNumId w:val="0"/>
+  </w:num>
+  <w:num w:numId="4" w16cid:durableId="1937638267">
+    <w:abstractNumId w:val="2"/>
   </w:num>
 </w:numbering>
 </file>

</xml_diff>